<commit_message>
Update Slides 9 and 10
</commit_message>
<xml_diff>
--- a/class09w.docx
+++ b/class09w.docx
@@ -137,7 +137,14 @@
         </w:numPr>
       </w:pPr>
       <w:r>
-        <w:t xml:space="preserve">Favorite Movies: Session 2</w:t>
+        <w:rPr>
+          <w:b/>
+          <w:bCs/>
+        </w:rPr>
+        <w:t xml:space="preserve">1:45 PM</w:t>
+      </w:r>
+      <w:r>
+        <w:t xml:space="preserve">: Favorite Movies: Session 2</w:t>
       </w:r>
     </w:p>
     <w:bookmarkEnd w:id="9"/>
@@ -5043,13 +5050,13 @@
       </w:r>
     </w:p>
     <w:bookmarkEnd w:id="53"/>
-    <w:bookmarkStart w:id="76" w:name="X582ef56de0ce79121eeaf61757e96186a11ea4f"/>
+    <w:bookmarkStart w:id="76" w:name="on-to-linear-regression"/>
     <w:p>
       <w:pPr>
         <w:pStyle w:val="Heading1"/>
       </w:pPr>
       <w:r>
-        <w:t xml:space="preserve">Standing Break, and then we’ll discuss linear regression</w:t>
+        <w:t xml:space="preserve">On to Linear Regression</w:t>
       </w:r>
     </w:p>
     <w:bookmarkStart w:id="54" w:name="association-of-two-quantities"/>

</xml_diff>